<commit_message>
Pacto Sincrético: quitar cláusula IX (contratos maestros >$500K) de Decisiones Importantes
</commit_message>
<xml_diff>
--- a/m/Sincretico_Pacto_de_Socios_v1.0.docx
+++ b/m/Sincretico_Pacto_de_Socios_v1.0.docx
@@ -2838,20 +2838,6 @@
     </w:p>
     <w:p>
       <w:pPr>
-        <w:numPr>
-          <w:ilvl w:val="0"/>
-          <w:numId w:val="1019"/>
-        </w:numPr>
-      </w:pPr>
-      <w:r>
-        <w:rPr>
-          <w:b/>
-        </w:rPr>
-        <w:t xml:space="preserve">La firma de contratos maestros de touroperación con marcas terceras cuyo valor anual sea superior a MXP $500,000.00 (quinientos mil Pesos 00/100 M.N.).</w:t>
-      </w:r>
-    </w:p>
-    <w:p>
-      <w:pPr>
         <w:pStyle w:val="FirstParagraph"/>
       </w:pPr>
       <w:r>
@@ -4840,6 +4826,12 @@
           <w:i/>
         </w:rPr>
         <w:t xml:space="preserve">Documento base en control de cambios. Última versión: 1.0 · [FECHA]. Publicado en grupocasapepe.netlify.app/m/socios-deck-sincretico para revisión de socios.</w:t>
+      </w:r>
+      <w:r>
+        <w:t xml:space="preserve"> </w:t>
+      </w:r>
+      <w:r>
+        <w:t xml:space="preserve"/>
       </w:r>
     </w:p>
     <w:sectPr/>

</xml_diff>